<commit_message>
docs(game-model): consolidate session and exercise templates, refresh team identity doc
Merge the reduced session/exercise templates into their canonical files and
add a PDF export of the team identity document.

Co-Authored-By: Claude Sonnet 5 <noreply@anthropic.com>
</commit_message>
<xml_diff>
--- a/docs/game-model/Identidad-del-Equipo-Familias.docx
+++ b/docs/game-model/Identidad-del-Equipo-Familias.docx
@@ -295,7 +295,27 @@
           <w:iCs/>
           <w:color w:val="0B3D24"/>
         </w:rPr>
-        <w:t>Jugamos con cabeza, en equipo, sin prisas innecesarias pero sin miedo cuando toca ser valientes. Es un fútbol que premia entender el juego y ayudarse entre todos, no solo correr más que el resto.</w:t>
+        <w:t xml:space="preserve">Jugamos con cabeza, en equipo, sin prisas </w:t>
+      </w:r>
+      <w:r>
+        <w:rPr>
+          <w:b/>
+          <w:bCs/>
+          <w:i/>
+          <w:iCs/>
+          <w:color w:val="0B3D24"/>
+        </w:rPr>
+        <w:t>innecesarias,</w:t>
+      </w:r>
+      <w:r>
+        <w:rPr>
+          <w:b/>
+          <w:bCs/>
+          <w:i/>
+          <w:iCs/>
+          <w:color w:val="0B3D24"/>
+        </w:rPr>
+        <w:t xml:space="preserve"> pero sin miedo cuando toca ser valientes. Es un fútbol que premia entender el juego y ayudarse entre todos, no solo correr más que el resto.</w:t>
       </w:r>
     </w:p>
     <w:p>

</xml_diff>